<commit_message>
Embed 4-way partitioning and model selection infographics in project report
</commit_message>
<xml_diff>
--- a/VIT_SCOPE_Project_Report_Completed.docx
+++ b/VIT_SCOPE_Project_Report_Completed.docx
@@ -1560,7 +1560,7 @@
           <w:rFonts w:ascii="Times New Roman" w:hAnsi="Times New Roman"/>
           <w:sz w:val="22"/>
         </w:rPr>
-        <w:t>Figure 4: Selected model Mean Absolute Error (MAE) by target across scaffold and publication holdout splits</w:t>
+        <w:t>Figure 4: Four-way grouped Bemis–Murcko scaffold data partitioning and split-conformal uncertainty calibration workflow</w:t>
       </w:r>
       <w:r>
         <w:rPr>
@@ -1576,7 +1576,7 @@
           <w:b/>
           <w:sz w:val="22"/>
         </w:rPr>
-        <w:t>36</w:t>
+        <w:t>28</w:t>
       </w:r>
     </w:p>
     <w:p>
@@ -1588,7 +1588,7 @@
           <w:rFonts w:ascii="Times New Roman" w:hAnsi="Times New Roman"/>
           <w:sz w:val="22"/>
         </w:rPr>
-        <w:t>Figure 5: Empirical split-conformal prediction interval coverage across targets compared to 90% nominal level</w:t>
+        <w:t>Figure 5: Selected model Mean Absolute Error (MAE) by target across scaffold and publication holdout splits</w:t>
       </w:r>
       <w:r>
         <w:rPr>
@@ -1604,7 +1604,63 @@
           <w:b/>
           <w:sz w:val="22"/>
         </w:rPr>
-        <w:t>38</w:t>
+        <w:t>37</w:t>
+      </w:r>
+    </w:p>
+    <w:p>
+      <w:pPr>
+        <w:spacing w:line="288" w:lineRule="auto" w:after="80"/>
+      </w:pPr>
+      <w:r>
+        <w:rPr>
+          <w:rFonts w:ascii="Times New Roman" w:hAnsi="Times New Roman"/>
+          <w:sz w:val="22"/>
+        </w:rPr>
+        <w:t>Figure 6: Empirical split-conformal prediction interval coverage across targets compared to 90% nominal level</w:t>
+      </w:r>
+      <w:r>
+        <w:rPr>
+          <w:rFonts w:ascii="Times New Roman" w:hAnsi="Times New Roman"/>
+          <w:color w:val="718096"/>
+          <w:sz w:val="20"/>
+        </w:rPr>
+        <w:t xml:space="preserve"> ................................... </w:t>
+      </w:r>
+      <w:r>
+        <w:rPr>
+          <w:rFonts w:ascii="Times New Roman" w:hAnsi="Times New Roman"/>
+          <w:b/>
+          <w:sz w:val="22"/>
+        </w:rPr>
+        <w:t>39</w:t>
+      </w:r>
+    </w:p>
+    <w:p>
+      <w:pPr>
+        <w:spacing w:line="288" w:lineRule="auto" w:after="80"/>
+      </w:pPr>
+      <w:r>
+        <w:rPr>
+          <w:rFonts w:ascii="Times New Roman" w:hAnsi="Times New Roman"/>
+          <w:sz w:val="22"/>
+        </w:rPr>
+        <w:t>Figure 7: Model selection architecture and comparative benchmark across baseline and ensemble families</w:t>
+      </w:r>
+      <w:r>
+        <w:rPr>
+          <w:rFonts w:ascii="Times New Roman" w:hAnsi="Times New Roman"/>
+          <w:color w:val="718096"/>
+          <w:sz w:val="20"/>
+        </w:rPr>
+        <w:t xml:space="preserve"> ................................... </w:t>
+      </w:r>
+      <w:r>
+        <w:rPr>
+          <w:rFonts w:ascii="Times New Roman" w:hAnsi="Times New Roman"/>
+          <w:b/>
+          <w:sz w:val="22"/>
+        </w:rPr>
+        <w:t>41</w:t>
       </w:r>
     </w:p>
     <w:p>
@@ -3844,6 +3900,77 @@
           <w:sz w:val="24"/>
         </w:rPr>
         <w:t>4. Citation DAG Deduplication and Echo Discounting: To eliminate citation echo bias in medical literature, we model published papers as a Directed Acyclic Graph G = (V, E), where vertices V represent published study records and directed edges (u, v) in E denote that publication u directly cites earlier publication v. The algorithm traverses the graph topologically, identifying root empirical clinical trials (out-degree = 0) and flagging descendant review articles as derivative echoes. When computing cumulative evidentiary weight, derivative review edges are collapsed, preventing citation echo chambers from artificially inflating evidence counts.</w:t>
+      </w:r>
+    </w:p>
+    <w:p>
+      <w:pPr>
+        <w:spacing w:line="360" w:lineRule="auto" w:after="120"/>
+        <w:jc w:val="both"/>
+      </w:pPr>
+      <w:r>
+        <w:rPr>
+          <w:rFonts w:ascii="Times New Roman" w:hAnsi="Times New Roman"/>
+          <w:b w:val="0"/>
+          <w:i w:val="0"/>
+          <w:sz w:val="24"/>
+        </w:rPr>
+        <w:t>5. Four-Way Grouped Scaffold Partitioning and Conformal Calibration: In standard machine learning, random train-test splitting allows chemical analogues (molecules differing by only a minor substituent) to leak across partitions, resulting in artificial memorization. To enforce strict generalization to novel chemotypes, our system partitions data strictly by Bemis–Murcko scaffold clusters into four disjoint partitions: Training (60%) for model fitting, Validation (15%) for hyperparameter selection, Calibration (10%) for distribution-free non-conformity threshold estimation, and Test (15%) for final unbiased evaluation. Crucially, conformal prediction theory strictly mandates an independent calibration partition isolated from model selection to avoid winner's curse and empirical coverage degradation. Figure 4 illustrates the four-way partitioning and conformal calibration workflow.</w:t>
+      </w:r>
+    </w:p>
+    <w:p>
+      <w:pPr>
+        <w:keepNext/>
+        <w:spacing w:before="240" w:after="80"/>
+        <w:jc w:val="center"/>
+      </w:pPr>
+      <w:r>
+        <w:drawing>
+          <wp:inline xmlns:a="http://schemas.openxmlformats.org/drawingml/2006/main" xmlns:pic="http://schemas.openxmlformats.org/drawingml/2006/picture">
+            <wp:extent cx="5486400" cy="3422290"/>
+            <wp:docPr id="5" name="Picture 5"/>
+            <wp:cNvGraphicFramePr>
+              <a:graphicFrameLocks noChangeAspect="1"/>
+            </wp:cNvGraphicFramePr>
+            <a:graphic>
+              <a:graphicData uri="http://schemas.openxmlformats.org/drawingml/2006/picture">
+                <pic:pic>
+                  <pic:nvPicPr>
+                    <pic:cNvPr id="0" name="four_way_partitioning_and_conformal_calibration.png"/>
+                    <pic:cNvPicPr/>
+                  </pic:nvPicPr>
+                  <pic:blipFill>
+                    <a:blip r:embed="rId13"/>
+                    <a:stretch>
+                      <a:fillRect/>
+                    </a:stretch>
+                  </pic:blipFill>
+                  <pic:spPr>
+                    <a:xfrm>
+                      <a:off x="0" y="0"/>
+                      <a:ext cx="5486400" cy="3422290"/>
+                    </a:xfrm>
+                    <a:prstGeom prst="rect"/>
+                  </pic:spPr>
+                </pic:pic>
+              </a:graphicData>
+            </a:graphic>
+          </wp:inline>
+        </w:drawing>
+      </w:r>
+    </w:p>
+    <w:p>
+      <w:pPr>
+        <w:spacing w:before="40" w:after="280"/>
+        <w:jc w:val="center"/>
+      </w:pPr>
+      <w:r>
+        <w:rPr>
+          <w:rFonts w:ascii="Times New Roman" w:hAnsi="Times New Roman"/>
+          <w:i/>
+          <w:color w:val="4A5568"/>
+          <w:sz w:val="21"/>
+        </w:rPr>
+        <w:t>Figure 4: Four-way grouped Bemis–Murcko scaffold data partitioning (Train 60%, Validation 15%, Calibration 10%, Test 15%) and split-conformal calibration workflow with non-conformity score quantile thresholding.</w:t>
       </w:r>
     </w:p>
     <w:p>
@@ -7504,7 +7631,7 @@
           <w:i w:val="0"/>
           <w:sz w:val="24"/>
         </w:rPr>
-        <w:t>Figure 4 illustrates the target-by-target Mean Absolute Error (MAE) comparisons between the scaffold holdout and publication holdout.</w:t>
+        <w:t>Figure 5 illustrates the target-by-target Mean Absolute Error (MAE) comparisons between the scaffold holdout and publication holdout.</w:t>
       </w:r>
     </w:p>
     <w:p>
@@ -7517,7 +7644,7 @@
         <w:drawing>
           <wp:inline xmlns:a="http://schemas.openxmlformats.org/drawingml/2006/main" xmlns:pic="http://schemas.openxmlformats.org/drawingml/2006/picture">
             <wp:extent cx="5303520" cy="2010404"/>
-            <wp:docPr id="5" name="Picture 5"/>
+            <wp:docPr id="6" name="Picture 6"/>
             <wp:cNvGraphicFramePr>
               <a:graphicFrameLocks noChangeAspect="1"/>
             </wp:cNvGraphicFramePr>
@@ -7529,7 +7656,7 @@
                     <pic:cNvPicPr/>
                   </pic:nvPicPr>
                   <pic:blipFill>
-                    <a:blip r:embed="rId13"/>
+                    <a:blip r:embed="rId14"/>
                     <a:stretch>
                       <a:fillRect/>
                     </a:stretch>
@@ -7560,7 +7687,7 @@
           <w:color w:val="4A5568"/>
           <w:sz w:val="21"/>
         </w:rPr>
-        <w:t>Figure 4: Selected model Mean Absolute Error (MAE in pIC50) across the six target endpoints, comparing the molecular scaffold-disjoint evaluation against the cross-laboratory publication-disjoint evaluation.</w:t>
+        <w:t>Figure 5: Selected model Mean Absolute Error (MAE in pIC50) across the six target endpoints, comparing the molecular scaffold-disjoint evaluation against the cross-laboratory publication-disjoint evaluation.</w:t>
       </w:r>
     </w:p>
     <w:p>
@@ -7575,7 +7702,7 @@
           <w:i w:val="0"/>
           <w:sz w:val="24"/>
         </w:rPr>
-        <w:t>As demonstrated in Table 5 and Figure 4, the scaffold-held-out models demonstrate robust predictive capability. Across the 2,116 held-out molecular samples, the pooled MAE is 0.4974 pIC50 with a bootstrap 95% confidence interval of [0.4754, 0.5183], an RMSE of 0.6521, and an overall R² of 0.3440. Because pIC50 represents a logarithmic scale, an MAE of ~0.50 corresponds to predicting the actual inhibitory IC50 concentration within approximately a 3.1-fold error margin (~ 10^{0.4974}), which is well within standard inter-laboratory assay experimental variance in bioactivity literature. Strongest performance is achieved on ABCB1 (R² = 0.507, MAE = 0.495), CYP3A4 (R² = 0.350, MAE = 0.482), and CYP2D6 (R² = 0.322, MAE = 0.513).</w:t>
+        <w:t>As demonstrated in Table 5 and Figure 5, the scaffold-held-out models demonstrate robust predictive capability. Across the 2,116 held-out molecular samples, the pooled MAE is 0.4974 pIC50 with a bootstrap 95% confidence interval of [0.4754, 0.5183], an RMSE of 0.6521, and an overall R² of 0.3440. Because pIC50 represents a logarithmic scale, an MAE of ~0.50 corresponds to predicting the actual inhibitory IC50 concentration within approximately a 3.1-fold error margin (~ 10^{0.4974}), which is well within standard inter-laboratory assay experimental variance in bioactivity literature. Strongest performance is achieved on ABCB1 (R² = 0.507, MAE = 0.495), CYP3A4 (R² = 0.350, MAE = 0.482), and CYP2D6 (R² = 0.322, MAE = 0.513).</w:t>
       </w:r>
     </w:p>
     <w:p>
@@ -7590,7 +7717,7 @@
           <w:i w:val="0"/>
           <w:sz w:val="24"/>
         </w:rPr>
-        <w:t>Figure 5 visualizes the empirical test-set coverage achieved by the split-conformal prediction intervals across all targets.</w:t>
+        <w:t>Figure 6 visualizes the empirical test-set coverage achieved by the split-conformal prediction intervals across all targets.</w:t>
       </w:r>
     </w:p>
     <w:p>
@@ -7603,7 +7730,7 @@
         <w:drawing>
           <wp:inline xmlns:a="http://schemas.openxmlformats.org/drawingml/2006/main" xmlns:pic="http://schemas.openxmlformats.org/drawingml/2006/picture">
             <wp:extent cx="5303520" cy="2027233"/>
-            <wp:docPr id="6" name="Picture 6"/>
+            <wp:docPr id="7" name="Picture 7"/>
             <wp:cNvGraphicFramePr>
               <a:graphicFrameLocks noChangeAspect="1"/>
             </wp:cNvGraphicFramePr>
@@ -7615,7 +7742,7 @@
                     <pic:cNvPicPr/>
                   </pic:nvPicPr>
                   <pic:blipFill>
-                    <a:blip r:embed="rId14"/>
+                    <a:blip r:embed="rId15"/>
                     <a:stretch>
                       <a:fillRect/>
                     </a:stretch>
@@ -7646,7 +7773,7 @@
           <w:color w:val="4A5568"/>
           <w:sz w:val="21"/>
         </w:rPr>
-        <w:t>Figure 5: Empirical test-set prediction interval coverage across targets under scaffold and publication holdouts, benchmarked against the nominal 90% confidence level (dashed horizontal line).</w:t>
+        <w:t>Figure 6: Empirical test-set prediction interval coverage across targets under scaffold and publication holdouts, benchmarked against the nominal 90% confidence level (dashed horizontal line).</w:t>
       </w:r>
     </w:p>
     <w:p>
@@ -8055,7 +8182,78 @@
           <w:i w:val="0"/>
           <w:sz w:val="24"/>
         </w:rPr>
-        <w:t>The comparative results demonstrate that non-linear ensemble methods significantly outperform both the naive training median baseline (reducing error from 0.6212 to 0.4981 MAE on scaffold holdout) and the linear Ridge model (0.5235 MAE). The ExtraTrees architecture successfully captures complex, non-linear pharmacophoric feature combinations that linear models cannot resolve. While the Repeat-Consistency Weighted ExtraTrees model achieved an MAE of 0.4995 (very close to standard ExtraTrees 0.4981), it provided superior robustness in down-weighting conflicting assay reports during training.</w:t>
+        <w:t>Figure 7 illustrates the overall model selection architecture and pooled comparative benchmarks across the four evaluated model families on both scaffold and publication holdout splits.</w:t>
+      </w:r>
+    </w:p>
+    <w:p>
+      <w:pPr>
+        <w:keepNext/>
+        <w:spacing w:before="240" w:after="80"/>
+        <w:jc w:val="center"/>
+      </w:pPr>
+      <w:r>
+        <w:drawing>
+          <wp:inline xmlns:a="http://schemas.openxmlformats.org/drawingml/2006/main" xmlns:pic="http://schemas.openxmlformats.org/drawingml/2006/picture">
+            <wp:extent cx="5486400" cy="3571830"/>
+            <wp:docPr id="8" name="Picture 8"/>
+            <wp:cNvGraphicFramePr>
+              <a:graphicFrameLocks noChangeAspect="1"/>
+            </wp:cNvGraphicFramePr>
+            <a:graphic>
+              <a:graphicData uri="http://schemas.openxmlformats.org/drawingml/2006/picture">
+                <pic:pic>
+                  <pic:nvPicPr>
+                    <pic:cNvPr id="0" name="model_selection_and_comparative_benchmark.png"/>
+                    <pic:cNvPicPr/>
+                  </pic:nvPicPr>
+                  <pic:blipFill>
+                    <a:blip r:embed="rId16"/>
+                    <a:stretch>
+                      <a:fillRect/>
+                    </a:stretch>
+                  </pic:blipFill>
+                  <pic:spPr>
+                    <a:xfrm>
+                      <a:off x="0" y="0"/>
+                      <a:ext cx="5486400" cy="3571830"/>
+                    </a:xfrm>
+                    <a:prstGeom prst="rect"/>
+                  </pic:spPr>
+                </pic:pic>
+              </a:graphicData>
+            </a:graphic>
+          </wp:inline>
+        </w:drawing>
+      </w:r>
+    </w:p>
+    <w:p>
+      <w:pPr>
+        <w:spacing w:before="40" w:after="280"/>
+        <w:jc w:val="center"/>
+      </w:pPr>
+      <w:r>
+        <w:rPr>
+          <w:rFonts w:ascii="Times New Roman" w:hAnsi="Times New Roman"/>
+          <w:i/>
+          <w:color w:val="4A5568"/>
+          <w:sz w:val="21"/>
+        </w:rPr>
+        <w:t>Figure 7: Model selection architecture and comparative benchmark across model families, illustrating the target-level validation selection rule and pooled test MAE across scaffold and publication holdouts.</w:t>
+      </w:r>
+    </w:p>
+    <w:p>
+      <w:pPr>
+        <w:spacing w:line="360" w:lineRule="auto" w:after="120"/>
+        <w:jc w:val="both"/>
+      </w:pPr>
+      <w:r>
+        <w:rPr>
+          <w:rFonts w:ascii="Times New Roman" w:hAnsi="Times New Roman"/>
+          <w:b w:val="0"/>
+          <w:i w:val="0"/>
+          <w:sz w:val="24"/>
+        </w:rPr>
+        <w:t>The comparative results in Table 7 and Figure 7 demonstrate that non-linear ensemble methods significantly outperform both the naive training median baseline (reducing error from 0.6212 to 0.4981 MAE on scaffold holdout) and the linear Ridge model (0.5235 MAE). The target-selected ensemble achieves the optimal pooled test MAE of 0.4974 (translating to a ~3.1-fold potency margin). The ExtraTrees architecture successfully captures complex, non-linear pharmacophoric feature combinations that linear models cannot resolve. While the Repeat-Consistency Weighted ExtraTrees model achieved an MAE of 0.4995 (very close to standard ExtraTrees 0.4981), it provided superior robustness in down-weighting conflicting assay reports during training. As illustrated in Panel D of Figure 7, publication-holdout errors (hatched bars) are consistently higher across all architectures (0.6613 vs 0.4974), reflecting the realistic inter-laboratory assay variability observed when evaluating across independent research institutions.</w:t>
       </w:r>
     </w:p>
     <w:p>

</xml_diff>